<commit_message>
Update isolator utility summary: power 1.5–5 kW, off-gas exhaust, CA+N2 both
Co-authored-by: peterli0913 <peterli0913@users.noreply.github.com>
</commit_message>
<xml_diff>
--- a/会议/英国高活实验室隔离器公用工程信息_答复Clare_中英对照.docx
+++ b/会议/英国高活实验室隔离器公用工程信息_答复Clare_中英对照.docx
@@ -187,7 +187,7 @@
               <w:rPr>
                 <w:sz w:val="20"/>
               </w:rPr>
-              <w:t>需要；实验室侧通常 220 V / 50 Hz 单路主电源。隔离器本体一般 ≤1.5 kW；总容量需叠加箱内设备（天平、小型反应/搅拌设备、油浴等）。集团内实验室参考约 1.2–1.3 kW；复杂场景可参考 ≤5.5 kW。待操作清单确认后最终定稿并留余量</w:t>
+              <w:t>需要；实验室侧通常 220 V / 50 Hz 单路主电源。隔离器本体一般 ≤1.5 kW；含箱内设备（天平、小型反应/搅拌设备、油浴等）总功率参考范围 **1.5–5 kW**</w:t>
             </w:r>
           </w:p>
         </w:tc>
@@ -200,7 +200,7 @@
               <w:rPr>
                 <w:sz w:val="20"/>
               </w:rPr>
-              <w:t>Typically 220 V / 50 Hz single supply. Isolator unit ≤1.5 kW; total must include in-isolator equipment. Internal lab reference ~1.2–1.3 kW; up to ~5.5 kW for complex cases. Final rating TBC with equipment list + margin</w:t>
+              <w:t>Typically 220 V / 50 Hz single supply. Isolator unit ≤1.5 kW; **total installed power (incl. in-isolator equipment) indicative range 1.5–5 kW**</w:t>
             </w:r>
           </w:p>
         </w:tc>
@@ -269,7 +269,7 @@
               <w:rPr>
                 <w:sz w:val="20"/>
               </w:rPr>
-              <w:t>实验室操作侧通常不需要；隔离器可预留接口。氮气与压缩空气一般二选一，高活实验室多用氮气</w:t>
+              <w:t>需要；隔离器本体用于气密封、控制等（与氮气均需配置）</w:t>
             </w:r>
           </w:p>
         </w:tc>
@@ -282,7 +282,7 @@
               <w:rPr>
                 <w:sz w:val="20"/>
               </w:rPr>
-              <w:t>Generally not required for routine lab ops; optional connection on isolator. Typically nitrogen OR compressed air — nitrogen preferred for HP</w:t>
+              <w:t>Required — isolator unit needs compressed air for gas seal, controls, etc. (**both nitrogen and compressed air required**)</w:t>
             </w:r>
           </w:p>
         </w:tc>

</xml_diff>